<commit_message>
docs(thesis): align report with code after full review
The seed defines 26 recipes but the demo database predated the 26th, so the
report was written against a stale count: a fresh database on the committee's
machine would show 26 dishes while the report said 25 everywhere. The 26th
dish is now in the demo database, every count is corrected (25 to 26 dishes,
23 to 24 suggestion matches), and the five screenshots showing the old
numbers were recaptured.

Also fixes citations [13]/[14] in chapter 2 that resolved to the wrong
entries after the three parts are merged, adds the three delete-behavior
relations missing from the chapter 3 table together with the rationale for
Favorite being Cascade while MenuPlanItem is Restrict, notes the In-Memory
provider's limits in the test methodology, numbers all 21 tables, and
unifies terminology (tất định, ứng dụng/dự án).

Body now runs to exactly 50 A4 pages.

Claude-Session: https://claude.ai/code/session_012fatjgVFdz2xoWKAyzm5GP
</commit_message>
<xml_diff>
--- a/thesis/doc/phan-1-tom-tat-mo-dau-chuong-1-2.docx
+++ b/thesis/doc/phan-1-tom-tat-mo-dau-chuong-1-2.docx
@@ -76,7 +76,7 @@
         <w:t xml:space="preserve"> </w:t>
       </w:r>
       <w:r>
-        <w:t xml:space="preserve">đình. Công việc này tưởng nhỏ nhưng gây tốn thời gian và dễ dẫn tới hai hệ quả:</w:t>
+        <w:t xml:space="preserve">đình. Công việc này có quy mô nhỏ nhưng tốn thời gian và dễ dẫn tới hai hệ quả:</w:t>
       </w:r>
       <w:r>
         <w:t xml:space="preserve"> </w:t>
@@ -335,13 +335,13 @@
         <w:t xml:space="preserve"> </w:t>
       </w:r>
       <w:r>
-        <w:t xml:space="preserve">mẫu gồm 25 món ăn Việt Nam, 40 nguyên liệu và 10 danh mục. Hệ thống cung cấp 47</w:t>
-      </w:r>
-      <w:r>
-        <w:t xml:space="preserve"> </w:t>
-      </w:r>
-      <w:r>
-        <w:t xml:space="preserve">chức năng phân theo ba mức quyền truy cập. Phần kiểm thử gồm</w:t>
+        <w:t xml:space="preserve">mẫu gồm 26 món ăn Việt Nam, 40 nguyên liệu và 10 danh mục. Hệ thống cung cấp 20</w:t>
+      </w:r>
+      <w:r>
+        <w:t xml:space="preserve"> </w:t>
+      </w:r>
+      <w:r>
+        <w:t xml:space="preserve">chức năng, phân thành ba nhóm theo mức quyền truy cập. Phần kiểm thử gồm</w:t>
       </w:r>
       <w:r>
         <w:t xml:space="preserve"> </w:t>
@@ -383,13 +383,13 @@
         <w:t xml:space="preserve"> </w:t>
       </w:r>
       <w:r>
-        <w:t xml:space="preserve">thực đơn: khi thư viện món không đủ lớn, tiêu chí phụ theo năng lượng khiến hệ</w:t>
-      </w:r>
-      <w:r>
-        <w:t xml:space="preserve"> </w:t>
-      </w:r>
-      <w:r>
-        <w:t xml:space="preserve">thống chọn lặp lại đúng một món cho mọi suất còn trống. Sau khi bổ sung tiêu chí</w:t>
+        <w:t xml:space="preserve">thực đơn. Cụ thể, khi thư viện món không đủ lớn, tiêu chí phụ theo năng lượng</w:t>
+      </w:r>
+      <w:r>
+        <w:t xml:space="preserve"> </w:t>
+      </w:r>
+      <w:r>
+        <w:t xml:space="preserve">khiến hệ thống chọn lặp lại đúng một món cho mọi suất còn trống. Sau khi bổ sung tiêu chí</w:t>
       </w:r>
       <w:r>
         <w:t xml:space="preserve"> </w:t>
@@ -1022,7 +1022,7 @@
         </w:numPr>
       </w:pPr>
       <w:r>
-        <w:t xml:space="preserve">Dữ liệu mẫu gồm 25 món ăn Việt Nam phổ biến, đủ để minh họa và kiểm chứng thuật</w:t>
+        <w:t xml:space="preserve">Dữ liệu mẫu gồm 26 món ăn Việt Nam phổ biến, đủ để minh họa và kiểm chứng thuật</w:t>
       </w:r>
       <w:r>
         <w:t xml:space="preserve"> </w:t>
@@ -1356,13 +1356,13 @@
         <w:t xml:space="preserve"> </w:t>
       </w:r>
       <w:r>
-        <w:t xml:space="preserve">món gì phụ thuộc vào nguyên liệu đang có; nguyên liệu cần mua lại phụ thuộc vào</w:t>
-      </w:r>
-      <w:r>
-        <w:t xml:space="preserve"> </w:t>
-      </w:r>
-      <w:r>
-        <w:t xml:space="preserve">các món dự định nấu; và thực đơn của một ngày nên xét trong tương quan với cả</w:t>
+        <w:t xml:space="preserve">món gì phụ thuộc vào nguyên liệu đang có. Nguyên liệu cần mua lại phụ thuộc vào</w:t>
+      </w:r>
+      <w:r>
+        <w:t xml:space="preserve"> </w:t>
+      </w:r>
+      <w:r>
+        <w:t xml:space="preserve">các món dự định nấu. Và thực đơn của một ngày nên xét trong tương quan với cả</w:t>
       </w:r>
       <w:r>
         <w:t xml:space="preserve"> </w:t>
@@ -2245,7 +2245,7 @@
         <w:t xml:space="preserve"> </w:t>
       </w:r>
       <w:r>
-        <w:t xml:space="preserve">và giao thực phẩm tươi; đến tháng 11/2023 doanh nghiệp đã thu hẹp hoạt động, rút</w:t>
+        <w:t xml:space="preserve">và giao thực phẩm tươi. Đến tháng 11/2023, doanh nghiệp đã thu hẹp hoạt động, rút</w:t>
       </w:r>
       <w:r>
         <w:t xml:space="preserve"> </w:t>
@@ -3213,21 +3213,31 @@
           <w:i/>
           <w:iCs/>
         </w:rPr>
-        <w:t xml:space="preserve">web cho phép: (a) xếp hạng các món có thể nấu từ một tập nguyên liệu cho trước,</w:t>
-      </w:r>
+        <w:t xml:space="preserve">web cho phép:</w:t>
+      </w:r>
+    </w:p>
+    <w:p>
+      <w:pPr>
+        <w:pStyle w:val="BlockText"/>
+      </w:pPr>
       <w:r>
         <w:rPr>
           <w:i/>
           <w:iCs/>
         </w:rPr>
-        <w:t xml:space="preserve"> </w:t>
-      </w:r>
+        <w:t xml:space="preserve">(a) xếp hạng các món có thể nấu từ một tập nguyên liệu cho trước;</w:t>
+      </w:r>
+    </w:p>
+    <w:p>
+      <w:pPr>
+        <w:pStyle w:val="BlockText"/>
+      </w:pPr>
       <w:r>
         <w:rPr>
           <w:i/>
           <w:iCs/>
         </w:rPr>
-        <w:t xml:space="preserve">(b) sinh tự động thực đơn cho bảy ngày với các ràng buộc về tính đa dạng và cân</w:t>
+        <w:t xml:space="preserve">(b) sinh tự động thực đơn cho bảy ngày với các ràng buộc về tính đa dạng và</w:t>
       </w:r>
       <w:r>
         <w:rPr>
@@ -3241,7 +3251,19 @@
           <w:i/>
           <w:iCs/>
         </w:rPr>
-        <w:t xml:space="preserve">đối năng lượng, và (c) tổng hợp danh sách nguyên liệu cần mua từ thực đơn đó.</w:t>
+        <w:t xml:space="preserve">cân đối năng lượng;</w:t>
+      </w:r>
+    </w:p>
+    <w:p>
+      <w:pPr>
+        <w:pStyle w:val="BlockText"/>
+      </w:pPr>
+      <w:r>
+        <w:rPr>
+          <w:i/>
+          <w:iCs/>
+        </w:rPr>
+        <w:t xml:space="preserve">(c) tổng hợp danh sách nguyên liệu cần mua từ thực đơn đó.</w:t>
       </w:r>
     </w:p>
     <w:p>
@@ -4970,7 +4992,7 @@
         <w:t xml:space="preserve"> </w:t>
       </w:r>
       <w:r>
-        <w:t xml:space="preserve">hai tập hợp [14]:</w:t>
+        <w:t xml:space="preserve">hai tập hợp [15]:</w:t>
       </w:r>
     </w:p>
     <w:p>
@@ -5824,7 +5846,7 @@
           <w:b/>
           <w:bCs/>
         </w:rPr>
-        <w:t xml:space="preserve">thứ tự xác định</w:t>
+        <w:t xml:space="preserve">thứ tự tất định</w:t>
       </w:r>
       <w:r>
         <w:t xml:space="preserve"> </w:t>
@@ -6321,7 +6343,7 @@
         <w:t xml:space="preserve"> </w:t>
       </w:r>
       <w:r>
-        <w:t xml:space="preserve">lựa chọn đã thực hiện [13]. Chiến lược này không bảo đảm nghiệm tối ưu toàn cục</w:t>
+        <w:t xml:space="preserve">lựa chọn đã thực hiện [14]. Chiến lược này không bảo đảm nghiệm tối ưu toàn cục</w:t>
       </w:r>
       <w:r>
         <w:t xml:space="preserve"> </w:t>
@@ -7623,7 +7645,36 @@
         <w:pStyle w:val="BodyText"/>
       </w:pPr>
       <w:r>
-        <w:t xml:space="preserve">[13] T. H. Cormen, C. E. Leiserson, R. L. Rivest, C. Stein.</w:t>
+        <w:t xml:space="preserve">[13] Apple App Store.</w:t>
+      </w:r>
+      <w:r>
+        <w:t xml:space="preserve"> </w:t>
+      </w:r>
+      <w:r>
+        <w:t xml:space="preserve">“Paprika Recipe Manager 3”</w:t>
+      </w:r>
+      <w:r>
+        <w:t xml:space="preserve">.</w:t>
+      </w:r>
+      <w:r>
+        <w:t xml:space="preserve"> </w:t>
+      </w:r>
+      <w:r>
+        <w:t xml:space="preserve">https://apps.apple.com/us/app/paprika-recipe-manager-3/id1303222628. Truy cập</w:t>
+      </w:r>
+      <w:r>
+        <w:t xml:space="preserve"> </w:t>
+      </w:r>
+      <w:r>
+        <w:t xml:space="preserve">ngày 25/07/2026.</w:t>
+      </w:r>
+    </w:p>
+    <w:p>
+      <w:pPr>
+        <w:pStyle w:val="BodyText"/>
+      </w:pPr>
+      <w:r>
+        <w:t xml:space="preserve">[14] T. H. Cormen, C. E. Leiserson, R. L. Rivest, C. Stein.</w:t>
       </w:r>
       <w:r>
         <w:t xml:space="preserve"> </w:t>
@@ -7664,7 +7715,7 @@
         <w:pStyle w:val="BodyText"/>
       </w:pPr>
       <w:r>
-        <w:t xml:space="preserve">[14] C. D. Manning, P. Raghavan, H. Schütze.</w:t>
+        <w:t xml:space="preserve">[15] C. D. Manning, P. Raghavan, H. Schütze.</w:t>
       </w:r>
       <w:r>
         <w:t xml:space="preserve"> </w:t>

</xml_diff>